<commit_message>
Actualizacion reporte IVR (#15)
Co-authored-by: CRISTIAN ANDRES PARDO ROJAS <pardoc@HILDEBOG.LOCAL>
</commit_message>
<xml_diff>
--- a/ruta/InformeFinal.docx
+++ b/ruta/InformeFinal.docx
@@ -1,6 +1,6 @@
 
 <file path=word/document.xml><?xml version="1.0" encoding="utf-8"?>
-<w:document xmlns:wpc="http://schemas.microsoft.com/office/word/2010/wordprocessingCanvas" xmlns:cx="http://schemas.microsoft.com/office/drawing/2014/chartex" xmlns:cx1="http://schemas.microsoft.com/office/drawing/2015/9/8/chartex" xmlns:cx2="http://schemas.microsoft.com/office/drawing/2015/10/21/chartex" xmlns:cx3="http://schemas.microsoft.com/office/drawing/2016/5/9/chartex" xmlns:cx4="http://schemas.microsoft.com/office/drawing/2016/5/10/chartex" xmlns:cx5="http://schemas.microsoft.com/office/drawing/2016/5/11/chartex" xmlns:cx6="http://schemas.microsoft.com/office/drawing/2016/5/12/chartex" xmlns:cx7="http://schemas.microsoft.com/office/drawing/2016/5/13/chartex" xmlns:cx8="http://schemas.microsoft.com/office/drawing/2016/5/14/chartex" xmlns:mc="http://schemas.openxmlformats.org/markup-compatibility/2006" xmlns:aink="http://schemas.microsoft.com/office/drawing/2016/ink" xmlns:am3d="http://schemas.microsoft.com/office/drawing/2017/model3d" xmlns:o="urn:schemas-microsoft-com:office:office" xmlns:oel="http://schemas.microsoft.com/office/2019/extlst" xmlns:r="http://schemas.openxmlformats.org/officeDocument/2006/relationships" xmlns:m="http://schemas.openxmlformats.org/officeDocument/2006/math" xmlns:v="urn:schemas-microsoft-com:vml" xmlns:wp14="http://schemas.microsoft.com/office/word/2010/wordprocessingDrawing" xmlns:wp="http://schemas.openxmlformats.org/drawingml/2006/wordprocessingDrawing" xmlns:w10="urn:schemas-microsoft-com:office:word" xmlns:w="http://schemas.openxmlformats.org/wordprocessingml/2006/main" xmlns:w14="http://schemas.microsoft.com/office/word/2010/wordml" xmlns:w15="http://schemas.microsoft.com/office/word/2012/wordml" xmlns:w16cex="http://schemas.microsoft.com/office/word/2018/wordml/cex" xmlns:w16cid="http://schemas.microsoft.com/office/word/2016/wordml/cid" xmlns:w16="http://schemas.microsoft.com/office/word/2018/wordml" xmlns:w16du="http://schemas.microsoft.com/office/word/2023/wordml/word16du" xmlns:w16sdtdh="http://schemas.microsoft.com/office/word/2020/wordml/sdtdatahash" xmlns:w16sdtfl="http://schemas.microsoft.com/office/word/2024/wordml/sdtformatlock" xmlns:w16se="http://schemas.microsoft.com/office/word/2015/wordml/symex" xmlns:wpg="http://schemas.microsoft.com/office/word/2010/wordprocessingGroup" xmlns:wpi="http://schemas.microsoft.com/office/word/2010/wordprocessingInk" xmlns:wne="http://schemas.microsoft.com/office/word/2006/wordml" xmlns:wps="http://schemas.microsoft.com/office/word/2010/wordprocessingShape" mc:Ignorable="w14 w15 w16se w16cid w16 w16cex w16sdtdh w16sdtfl w16du wp14">
+<w:document xmlns:wpc="http://schemas.microsoft.com/office/word/2010/wordprocessingCanvas" xmlns:cx="http://schemas.microsoft.com/office/drawing/2014/chartex" xmlns:cx1="http://schemas.microsoft.com/office/drawing/2015/9/8/chartex" xmlns:mc="http://schemas.openxmlformats.org/markup-compatibility/2006" xmlns:o="urn:schemas-microsoft-com:office:office" xmlns:r="http://schemas.openxmlformats.org/officeDocument/2006/relationships" xmlns:m="http://schemas.openxmlformats.org/officeDocument/2006/math" xmlns:v="urn:schemas-microsoft-com:vml" xmlns:wp14="http://schemas.microsoft.com/office/word/2010/wordprocessingDrawing" xmlns:wp="http://schemas.openxmlformats.org/drawingml/2006/wordprocessingDrawing" xmlns:w10="urn:schemas-microsoft-com:office:word" xmlns:w="http://schemas.openxmlformats.org/wordprocessingml/2006/main" xmlns:w14="http://schemas.microsoft.com/office/word/2010/wordml" xmlns:w15="http://schemas.microsoft.com/office/word/2012/wordml" xmlns:w16se="http://schemas.microsoft.com/office/word/2015/wordml/symex" xmlns:wpg="http://schemas.microsoft.com/office/word/2010/wordprocessingGroup" xmlns:wpi="http://schemas.microsoft.com/office/word/2010/wordprocessingInk" xmlns:wne="http://schemas.microsoft.com/office/word/2006/wordml" xmlns:wps="http://schemas.microsoft.com/office/word/2010/wordprocessingShape" mc:Ignorable="w14 w15 w16se wp14">
   <w:body>
     <w:tbl>
       <w:tblPr>
@@ -126,10 +126,7 @@
           </w:tcPr>
           <w:p>
             <w:r>
-              <w:t xml:space="preserve">LINEA Y PLAN </w:t>
-            </w:r>
-            <w:r>
-              <w:tab/>
+              <w:t>LINEA</w:t>
             </w:r>
           </w:p>
         </w:tc>
@@ -149,7 +146,42 @@
                 <w:rFonts w:ascii="Calibri" w:hAnsi="Calibri" w:cs="Calibri"/>
                 <w:color w:val="000000"/>
               </w:rPr>
-              <w:t>{{LINEA}}</w:t>
+              <w:t>{{LINEA_PROBADA}}</w:t>
+            </w:r>
+            <w:bookmarkStart w:id="0" w:name="_GoBack"/>
+            <w:bookmarkEnd w:id="0"/>
+          </w:p>
+        </w:tc>
+      </w:tr>
+      <w:tr>
+        <w:tc>
+          <w:tcPr>
+            <w:tcW w:w="2972" w:type="dxa"/>
+            <w:shd w:val="clear" w:color="auto" w:fill="C00000"/>
+          </w:tcPr>
+          <w:p>
+            <w:r>
+              <w:t>HORA_INICIO</w:t>
+            </w:r>
+          </w:p>
+        </w:tc>
+        <w:tc>
+          <w:tcPr>
+            <w:tcW w:w="6237" w:type="dxa"/>
+          </w:tcPr>
+          <w:p>
+            <w:pPr>
+              <w:rPr>
+                <w:rFonts w:ascii="Calibri" w:hAnsi="Calibri" w:cs="Calibri"/>
+                <w:color w:val="000000"/>
+              </w:rPr>
+            </w:pPr>
+            <w:r>
+              <w:rPr>
+                <w:rFonts w:ascii="Calibri" w:hAnsi="Calibri" w:cs="Calibri"/>
+                <w:color w:val="000000"/>
+              </w:rPr>
+              <w:t>{{HORA_INICIO}}</w:t>
             </w:r>
           </w:p>
         </w:tc>
@@ -203,7 +235,7 @@
 </file>
 
 <file path=word/endnotes.xml><?xml version="1.0" encoding="utf-8"?>
-<w:endnotes xmlns:wpc="http://schemas.microsoft.com/office/word/2010/wordprocessingCanvas" xmlns:cx="http://schemas.microsoft.com/office/drawing/2014/chartex" xmlns:cx1="http://schemas.microsoft.com/office/drawing/2015/9/8/chartex" xmlns:cx2="http://schemas.microsoft.com/office/drawing/2015/10/21/chartex" xmlns:cx3="http://schemas.microsoft.com/office/drawing/2016/5/9/chartex" xmlns:cx4="http://schemas.microsoft.com/office/drawing/2016/5/10/chartex" xmlns:cx5="http://schemas.microsoft.com/office/drawing/2016/5/11/chartex" xmlns:cx6="http://schemas.microsoft.com/office/drawing/2016/5/12/chartex" xmlns:cx7="http://schemas.microsoft.com/office/drawing/2016/5/13/chartex" xmlns:cx8="http://schemas.microsoft.com/office/drawing/2016/5/14/chartex" xmlns:mc="http://schemas.openxmlformats.org/markup-compatibility/2006" xmlns:aink="http://schemas.microsoft.com/office/drawing/2016/ink" xmlns:am3d="http://schemas.microsoft.com/office/drawing/2017/model3d" xmlns:o="urn:schemas-microsoft-com:office:office" xmlns:oel="http://schemas.microsoft.com/office/2019/extlst" xmlns:r="http://schemas.openxmlformats.org/officeDocument/2006/relationships" xmlns:m="http://schemas.openxmlformats.org/officeDocument/2006/math" xmlns:v="urn:schemas-microsoft-com:vml" xmlns:wp14="http://schemas.microsoft.com/office/word/2010/wordprocessingDrawing" xmlns:wp="http://schemas.openxmlformats.org/drawingml/2006/wordprocessingDrawing" xmlns:w10="urn:schemas-microsoft-com:office:word" xmlns:w="http://schemas.openxmlformats.org/wordprocessingml/2006/main" xmlns:w14="http://schemas.microsoft.com/office/word/2010/wordml" xmlns:w15="http://schemas.microsoft.com/office/word/2012/wordml" xmlns:w16cex="http://schemas.microsoft.com/office/word/2018/wordml/cex" xmlns:w16cid="http://schemas.microsoft.com/office/word/2016/wordml/cid" xmlns:w16="http://schemas.microsoft.com/office/word/2018/wordml" xmlns:w16du="http://schemas.microsoft.com/office/word/2023/wordml/word16du" xmlns:w16sdtdh="http://schemas.microsoft.com/office/word/2020/wordml/sdtdatahash" xmlns:w16sdtfl="http://schemas.microsoft.com/office/word/2024/wordml/sdtformatlock" xmlns:w16se="http://schemas.microsoft.com/office/word/2015/wordml/symex" xmlns:wpg="http://schemas.microsoft.com/office/word/2010/wordprocessingGroup" xmlns:wpi="http://schemas.microsoft.com/office/word/2010/wordprocessingInk" xmlns:wne="http://schemas.microsoft.com/office/word/2006/wordml" xmlns:wps="http://schemas.microsoft.com/office/word/2010/wordprocessingShape" mc:Ignorable="w14 w15 w16se w16cid w16 w16cex w16sdtdh w16sdtfl w16du wp14">
+<w:endnotes xmlns:wpc="http://schemas.microsoft.com/office/word/2010/wordprocessingCanvas" xmlns:cx="http://schemas.microsoft.com/office/drawing/2014/chartex" xmlns:cx1="http://schemas.microsoft.com/office/drawing/2015/9/8/chartex" xmlns:mc="http://schemas.openxmlformats.org/markup-compatibility/2006" xmlns:o="urn:schemas-microsoft-com:office:office" xmlns:r="http://schemas.openxmlformats.org/officeDocument/2006/relationships" xmlns:m="http://schemas.openxmlformats.org/officeDocument/2006/math" xmlns:v="urn:schemas-microsoft-com:vml" xmlns:wp14="http://schemas.microsoft.com/office/word/2010/wordprocessingDrawing" xmlns:wp="http://schemas.openxmlformats.org/drawingml/2006/wordprocessingDrawing" xmlns:w10="urn:schemas-microsoft-com:office:word" xmlns:w="http://schemas.openxmlformats.org/wordprocessingml/2006/main" xmlns:w14="http://schemas.microsoft.com/office/word/2010/wordml" xmlns:w15="http://schemas.microsoft.com/office/word/2012/wordml" xmlns:w16se="http://schemas.microsoft.com/office/word/2015/wordml/symex" xmlns:wpg="http://schemas.microsoft.com/office/word/2010/wordprocessingGroup" xmlns:wpi="http://schemas.microsoft.com/office/word/2010/wordprocessingInk" xmlns:wne="http://schemas.microsoft.com/office/word/2006/wordml" xmlns:wps="http://schemas.microsoft.com/office/word/2010/wordprocessingShape" mc:Ignorable="w14 w15 w16se wp14">
   <w:endnote w:type="separator" w:id="-1">
     <w:p>
       <w:r>
@@ -222,7 +254,7 @@
 </file>
 
 <file path=word/footnotes.xml><?xml version="1.0" encoding="utf-8"?>
-<w:footnotes xmlns:wpc="http://schemas.microsoft.com/office/word/2010/wordprocessingCanvas" xmlns:cx="http://schemas.microsoft.com/office/drawing/2014/chartex" xmlns:cx1="http://schemas.microsoft.com/office/drawing/2015/9/8/chartex" xmlns:cx2="http://schemas.microsoft.com/office/drawing/2015/10/21/chartex" xmlns:cx3="http://schemas.microsoft.com/office/drawing/2016/5/9/chartex" xmlns:cx4="http://schemas.microsoft.com/office/drawing/2016/5/10/chartex" xmlns:cx5="http://schemas.microsoft.com/office/drawing/2016/5/11/chartex" xmlns:cx6="http://schemas.microsoft.com/office/drawing/2016/5/12/chartex" xmlns:cx7="http://schemas.microsoft.com/office/drawing/2016/5/13/chartex" xmlns:cx8="http://schemas.microsoft.com/office/drawing/2016/5/14/chartex" xmlns:mc="http://schemas.openxmlformats.org/markup-compatibility/2006" xmlns:aink="http://schemas.microsoft.com/office/drawing/2016/ink" xmlns:am3d="http://schemas.microsoft.com/office/drawing/2017/model3d" xmlns:o="urn:schemas-microsoft-com:office:office" xmlns:oel="http://schemas.microsoft.com/office/2019/extlst" xmlns:r="http://schemas.openxmlformats.org/officeDocument/2006/relationships" xmlns:m="http://schemas.openxmlformats.org/officeDocument/2006/math" xmlns:v="urn:schemas-microsoft-com:vml" xmlns:wp14="http://schemas.microsoft.com/office/word/2010/wordprocessingDrawing" xmlns:wp="http://schemas.openxmlformats.org/drawingml/2006/wordprocessingDrawing" xmlns:w10="urn:schemas-microsoft-com:office:word" xmlns:w="http://schemas.openxmlformats.org/wordprocessingml/2006/main" xmlns:w14="http://schemas.microsoft.com/office/word/2010/wordml" xmlns:w15="http://schemas.microsoft.com/office/word/2012/wordml" xmlns:w16cex="http://schemas.microsoft.com/office/word/2018/wordml/cex" xmlns:w16cid="http://schemas.microsoft.com/office/word/2016/wordml/cid" xmlns:w16="http://schemas.microsoft.com/office/word/2018/wordml" xmlns:w16du="http://schemas.microsoft.com/office/word/2023/wordml/word16du" xmlns:w16sdtdh="http://schemas.microsoft.com/office/word/2020/wordml/sdtdatahash" xmlns:w16sdtfl="http://schemas.microsoft.com/office/word/2024/wordml/sdtformatlock" xmlns:w16se="http://schemas.microsoft.com/office/word/2015/wordml/symex" xmlns:wpg="http://schemas.microsoft.com/office/word/2010/wordprocessingGroup" xmlns:wpi="http://schemas.microsoft.com/office/word/2010/wordprocessingInk" xmlns:wne="http://schemas.microsoft.com/office/word/2006/wordml" xmlns:wps="http://schemas.microsoft.com/office/word/2010/wordprocessingShape" mc:Ignorable="w14 w15 w16se w16cid w16 w16cex w16sdtdh w16sdtfl w16du wp14">
+<w:footnotes xmlns:wpc="http://schemas.microsoft.com/office/word/2010/wordprocessingCanvas" xmlns:cx="http://schemas.microsoft.com/office/drawing/2014/chartex" xmlns:cx1="http://schemas.microsoft.com/office/drawing/2015/9/8/chartex" xmlns:mc="http://schemas.openxmlformats.org/markup-compatibility/2006" xmlns:o="urn:schemas-microsoft-com:office:office" xmlns:r="http://schemas.openxmlformats.org/officeDocument/2006/relationships" xmlns:m="http://schemas.openxmlformats.org/officeDocument/2006/math" xmlns:v="urn:schemas-microsoft-com:vml" xmlns:wp14="http://schemas.microsoft.com/office/word/2010/wordprocessingDrawing" xmlns:wp="http://schemas.openxmlformats.org/drawingml/2006/wordprocessingDrawing" xmlns:w10="urn:schemas-microsoft-com:office:word" xmlns:w="http://schemas.openxmlformats.org/wordprocessingml/2006/main" xmlns:w14="http://schemas.microsoft.com/office/word/2010/wordml" xmlns:w15="http://schemas.microsoft.com/office/word/2012/wordml" xmlns:w16se="http://schemas.microsoft.com/office/word/2015/wordml/symex" xmlns:wpg="http://schemas.microsoft.com/office/word/2010/wordprocessingGroup" xmlns:wpi="http://schemas.microsoft.com/office/word/2010/wordprocessingInk" xmlns:wne="http://schemas.microsoft.com/office/word/2006/wordml" xmlns:wps="http://schemas.microsoft.com/office/word/2010/wordprocessingShape" mc:Ignorable="w14 w15 w16se wp14">
   <w:footnote w:type="separator" w:id="-1">
     <w:p>
       <w:r>
@@ -241,7 +273,7 @@
 </file>
 
 <file path=word/header1.xml><?xml version="1.0" encoding="utf-8"?>
-<w:hdr xmlns:wpc="http://schemas.microsoft.com/office/word/2010/wordprocessingCanvas" xmlns:cx="http://schemas.microsoft.com/office/drawing/2014/chartex" xmlns:cx1="http://schemas.microsoft.com/office/drawing/2015/9/8/chartex" xmlns:cx2="http://schemas.microsoft.com/office/drawing/2015/10/21/chartex" xmlns:cx3="http://schemas.microsoft.com/office/drawing/2016/5/9/chartex" xmlns:cx4="http://schemas.microsoft.com/office/drawing/2016/5/10/chartex" xmlns:cx5="http://schemas.microsoft.com/office/drawing/2016/5/11/chartex" xmlns:cx6="http://schemas.microsoft.com/office/drawing/2016/5/12/chartex" xmlns:cx7="http://schemas.microsoft.com/office/drawing/2016/5/13/chartex" xmlns:cx8="http://schemas.microsoft.com/office/drawing/2016/5/14/chartex" xmlns:mc="http://schemas.openxmlformats.org/markup-compatibility/2006" xmlns:aink="http://schemas.microsoft.com/office/drawing/2016/ink" xmlns:am3d="http://schemas.microsoft.com/office/drawing/2017/model3d" xmlns:o="urn:schemas-microsoft-com:office:office" xmlns:oel="http://schemas.microsoft.com/office/2019/extlst" xmlns:r="http://schemas.openxmlformats.org/officeDocument/2006/relationships" xmlns:m="http://schemas.openxmlformats.org/officeDocument/2006/math" xmlns:v="urn:schemas-microsoft-com:vml" xmlns:wp14="http://schemas.microsoft.com/office/word/2010/wordprocessingDrawing" xmlns:wp="http://schemas.openxmlformats.org/drawingml/2006/wordprocessingDrawing" xmlns:w10="urn:schemas-microsoft-com:office:word" xmlns:w="http://schemas.openxmlformats.org/wordprocessingml/2006/main" xmlns:w14="http://schemas.microsoft.com/office/word/2010/wordml" xmlns:w15="http://schemas.microsoft.com/office/word/2012/wordml" xmlns:w16cex="http://schemas.microsoft.com/office/word/2018/wordml/cex" xmlns:w16cid="http://schemas.microsoft.com/office/word/2016/wordml/cid" xmlns:w16="http://schemas.microsoft.com/office/word/2018/wordml" xmlns:w16du="http://schemas.microsoft.com/office/word/2023/wordml/word16du" xmlns:w16sdtdh="http://schemas.microsoft.com/office/word/2020/wordml/sdtdatahash" xmlns:w16sdtfl="http://schemas.microsoft.com/office/word/2024/wordml/sdtformatlock" xmlns:w16se="http://schemas.microsoft.com/office/word/2015/wordml/symex" xmlns:wpg="http://schemas.microsoft.com/office/word/2010/wordprocessingGroup" xmlns:wpi="http://schemas.microsoft.com/office/word/2010/wordprocessingInk" xmlns:wne="http://schemas.microsoft.com/office/word/2006/wordml" xmlns:wps="http://schemas.microsoft.com/office/word/2010/wordprocessingShape" mc:Ignorable="w14 w15 w16se w16cid w16 w16cex w16sdtdh w16sdtfl w16du wp14">
+<w:hdr xmlns:wpc="http://schemas.microsoft.com/office/word/2010/wordprocessingCanvas" xmlns:cx="http://schemas.microsoft.com/office/drawing/2014/chartex" xmlns:cx1="http://schemas.microsoft.com/office/drawing/2015/9/8/chartex" xmlns:mc="http://schemas.openxmlformats.org/markup-compatibility/2006" xmlns:o="urn:schemas-microsoft-com:office:office" xmlns:r="http://schemas.openxmlformats.org/officeDocument/2006/relationships" xmlns:m="http://schemas.openxmlformats.org/officeDocument/2006/math" xmlns:v="urn:schemas-microsoft-com:vml" xmlns:wp14="http://schemas.microsoft.com/office/word/2010/wordprocessingDrawing" xmlns:wp="http://schemas.openxmlformats.org/drawingml/2006/wordprocessingDrawing" xmlns:w10="urn:schemas-microsoft-com:office:word" xmlns:w="http://schemas.openxmlformats.org/wordprocessingml/2006/main" xmlns:w14="http://schemas.microsoft.com/office/word/2010/wordml" xmlns:w15="http://schemas.microsoft.com/office/word/2012/wordml" xmlns:w16se="http://schemas.microsoft.com/office/word/2015/wordml/symex" xmlns:wpg="http://schemas.microsoft.com/office/word/2010/wordprocessingGroup" xmlns:wpi="http://schemas.microsoft.com/office/word/2010/wordprocessingInk" xmlns:wne="http://schemas.microsoft.com/office/word/2006/wordml" xmlns:wps="http://schemas.microsoft.com/office/word/2010/wordprocessingShape" mc:Ignorable="w14 w15 w16se wp14">
   <w:p>
     <w:pPr>
       <w:pStyle w:val="Encabezado"/>
@@ -345,7 +377,7 @@
 </file>
 
 <file path=word/styles.xml><?xml version="1.0" encoding="utf-8"?>
-<w:styles xmlns:mc="http://schemas.openxmlformats.org/markup-compatibility/2006" xmlns:r="http://schemas.openxmlformats.org/officeDocument/2006/relationships" xmlns:w="http://schemas.openxmlformats.org/wordprocessingml/2006/main" xmlns:w14="http://schemas.microsoft.com/office/word/2010/wordml" xmlns:w15="http://schemas.microsoft.com/office/word/2012/wordml" xmlns:w16cex="http://schemas.microsoft.com/office/word/2018/wordml/cex" xmlns:w16cid="http://schemas.microsoft.com/office/word/2016/wordml/cid" xmlns:w16="http://schemas.microsoft.com/office/word/2018/wordml" xmlns:w16du="http://schemas.microsoft.com/office/word/2023/wordml/word16du" xmlns:w16sdtdh="http://schemas.microsoft.com/office/word/2020/wordml/sdtdatahash" xmlns:w16sdtfl="http://schemas.microsoft.com/office/word/2024/wordml/sdtformatlock" xmlns:w16se="http://schemas.microsoft.com/office/word/2015/wordml/symex" mc:Ignorable="w14 w15 w16se w16cid w16 w16cex w16sdtdh w16sdtfl w16du">
+<w:styles xmlns:mc="http://schemas.openxmlformats.org/markup-compatibility/2006" xmlns:r="http://schemas.openxmlformats.org/officeDocument/2006/relationships" xmlns:w="http://schemas.openxmlformats.org/wordprocessingml/2006/main" xmlns:w14="http://schemas.microsoft.com/office/word/2010/wordml" xmlns:w15="http://schemas.microsoft.com/office/word/2012/wordml" xmlns:w16se="http://schemas.microsoft.com/office/word/2015/wordml/symex" mc:Ignorable="w14 w15 w16se">
   <w:docDefaults>
     <w:rPrDefault>
       <w:rPr>
@@ -363,7 +395,7 @@
       </w:pPr>
     </w:pPrDefault>
   </w:docDefaults>
-  <w:latentStyles w:defLockedState="0" w:defUIPriority="99" w:defSemiHidden="0" w:defUnhideWhenUsed="0" w:defQFormat="0" w:count="376">
+  <w:latentStyles w:defLockedState="0" w:defUIPriority="99" w:defSemiHidden="0" w:defUnhideWhenUsed="0" w:defQFormat="0" w:count="371">
     <w:lsdException w:name="Normal" w:uiPriority="0" w:qFormat="1"/>
     <w:lsdException w:name="heading 1" w:uiPriority="9" w:qFormat="1"/>
     <w:lsdException w:name="heading 2" w:semiHidden="1" w:uiPriority="9" w:unhideWhenUsed="1" w:qFormat="1"/>
@@ -735,11 +767,6 @@
     <w:lsdException w:name="List Table 5 Dark Accent 6" w:uiPriority="50"/>
     <w:lsdException w:name="List Table 6 Colorful Accent 6" w:uiPriority="51"/>
     <w:lsdException w:name="List Table 7 Colorful Accent 6" w:uiPriority="52"/>
-    <w:lsdException w:name="Mention" w:semiHidden="1" w:unhideWhenUsed="1"/>
-    <w:lsdException w:name="Smart Hyperlink" w:semiHidden="1" w:unhideWhenUsed="1"/>
-    <w:lsdException w:name="Hashtag" w:semiHidden="1" w:unhideWhenUsed="1"/>
-    <w:lsdException w:name="Unresolved Mention" w:semiHidden="1" w:unhideWhenUsed="1"/>
-    <w:lsdException w:name="Smart Link" w:semiHidden="1" w:unhideWhenUsed="1"/>
   </w:latentStyles>
   <w:style w:type="paragraph" w:default="1" w:styleId="Normal">
     <w:name w:val="Normal"/>
@@ -973,6 +1000,7 @@
   <w:style w:type="character" w:default="1" w:styleId="Fuentedeprrafopredeter">
     <w:name w:val="Default Paragraph Font"/>
     <w:uiPriority w:val="1"/>
+    <w:semiHidden/>
     <w:unhideWhenUsed/>
   </w:style>
   <w:style w:type="table" w:default="1" w:styleId="Tablanormal">

</xml_diff>